<commit_message>
Update CV documents with consistent capitalization, improved formatting, and additional skills
</commit_message>
<xml_diff>
--- a/assets/cv/Amr_Abdullah_CV.docx
+++ b/assets/cv/Amr_Abdullah_CV.docx
@@ -14,7 +14,7 @@
           <w:color w:val="1A3A5C"/>
           <w:sz w:val="52"/>
         </w:rPr>
-        <w:t>Amr Abdullah Selim</w:t>
+        <w:t>AMR ABDULLAH SELIM</w:t>
       </w:r>
     </w:p>
     <w:p>
@@ -126,12 +126,12 @@
         <w:tblW w:type="auto" w:w="0"/>
         <w:tblLook w:firstColumn="1" w:firstRow="1" w:lastColumn="0" w:lastRow="0" w:noHBand="0" w:noVBand="1" w:val="04A0"/>
         <w:tblBorders>
-          <w:top w:val="none" w:sz="0" w:space="0" w:color="auto"/>
-          <w:left w:val="none" w:sz="0" w:space="0" w:color="auto"/>
-          <w:bottom w:val="none" w:sz="0" w:space="0" w:color="auto"/>
-          <w:right w:val="none" w:sz="0" w:space="0" w:color="auto"/>
-          <w:insideH w:val="none" w:sz="0" w:space="0" w:color="auto"/>
-          <w:insideV w:val="none" w:sz="0" w:space="0" w:color="auto"/>
+          <w:top w:val="single" w:sz="6" w:space="0" w:color="1A3A5C"/>
+          <w:left w:val="single" w:sz="6" w:space="0" w:color="1A3A5C"/>
+          <w:bottom w:val="single" w:sz="6" w:space="0" w:color="1A3A5C"/>
+          <w:right w:val="single" w:sz="6" w:space="0" w:color="1A3A5C"/>
+          <w:insideH w:val="single" w:sz="6" w:space="0" w:color="1A3A5C"/>
+          <w:insideV w:val="single" w:sz="6" w:space="0" w:color="1A3A5C"/>
         </w:tblBorders>
       </w:tblPr>
       <w:tblGrid>
@@ -143,14 +143,12 @@
         <w:tc>
           <w:tcPr>
             <w:tcW w:type="dxa" w:w="3324"/>
-            <w:tcBdr>
-              <w:top w:val="none" w:sz="0" w:space="0" w:color="auto"/>
-              <w:left w:val="none" w:sz="0" w:space="0" w:color="auto"/>
-              <w:bottom w:val="none" w:sz="0" w:space="0" w:color="auto"/>
-              <w:right w:val="none" w:sz="0" w:space="0" w:color="auto"/>
-              <w:insideH w:val="none" w:sz="0" w:space="0" w:color="auto"/>
-              <w:insideV w:val="none" w:sz="0" w:space="0" w:color="auto"/>
-            </w:tcBdr>
+            <w:tcBorders>
+              <w:top w:val="single" w:sz="6" w:space="0" w:color="1A3A5C"/>
+              <w:left w:val="single" w:sz="6" w:space="0" w:color="1A3A5C"/>
+              <w:bottom w:val="single" w:sz="6" w:space="0" w:color="1A3A5C"/>
+              <w:right w:val="single" w:sz="6" w:space="0" w:color="1A3A5C"/>
+            </w:tcBorders>
           </w:tcPr>
           <w:p>
             <w:pPr>
@@ -181,14 +179,12 @@
         <w:tc>
           <w:tcPr>
             <w:tcW w:type="dxa" w:w="3324"/>
-            <w:tcBdr>
-              <w:top w:val="none" w:sz="0" w:space="0" w:color="auto"/>
-              <w:left w:val="none" w:sz="0" w:space="0" w:color="auto"/>
-              <w:bottom w:val="none" w:sz="0" w:space="0" w:color="auto"/>
-              <w:right w:val="none" w:sz="0" w:space="0" w:color="auto"/>
-              <w:insideH w:val="none" w:sz="0" w:space="0" w:color="auto"/>
-              <w:insideV w:val="none" w:sz="0" w:space="0" w:color="auto"/>
-            </w:tcBdr>
+            <w:tcBorders>
+              <w:top w:val="single" w:sz="6" w:space="0" w:color="1A3A5C"/>
+              <w:left w:val="single" w:sz="6" w:space="0" w:color="1A3A5C"/>
+              <w:bottom w:val="single" w:sz="6" w:space="0" w:color="1A3A5C"/>
+              <w:right w:val="single" w:sz="6" w:space="0" w:color="1A3A5C"/>
+            </w:tcBorders>
           </w:tcPr>
           <w:p>
             <w:pPr>
@@ -219,14 +215,12 @@
         <w:tc>
           <w:tcPr>
             <w:tcW w:type="dxa" w:w="3324"/>
-            <w:tcBdr>
-              <w:top w:val="none" w:sz="0" w:space="0" w:color="auto"/>
-              <w:left w:val="none" w:sz="0" w:space="0" w:color="auto"/>
-              <w:bottom w:val="none" w:sz="0" w:space="0" w:color="auto"/>
-              <w:right w:val="none" w:sz="0" w:space="0" w:color="auto"/>
-              <w:insideH w:val="none" w:sz="0" w:space="0" w:color="auto"/>
-              <w:insideV w:val="none" w:sz="0" w:space="0" w:color="auto"/>
-            </w:tcBdr>
+            <w:tcBorders>
+              <w:top w:val="single" w:sz="6" w:space="0" w:color="1A3A5C"/>
+              <w:left w:val="single" w:sz="6" w:space="0" w:color="1A3A5C"/>
+              <w:bottom w:val="single" w:sz="6" w:space="0" w:color="1A3A5C"/>
+              <w:right w:val="single" w:sz="6" w:space="0" w:color="1A3A5C"/>
+            </w:tcBorders>
           </w:tcPr>
           <w:p>
             <w:pPr>
@@ -259,14 +253,12 @@
         <w:tc>
           <w:tcPr>
             <w:tcW w:type="dxa" w:w="3324"/>
-            <w:tcBdr>
-              <w:top w:val="none" w:sz="0" w:space="0" w:color="auto"/>
-              <w:left w:val="none" w:sz="0" w:space="0" w:color="auto"/>
-              <w:bottom w:val="none" w:sz="0" w:space="0" w:color="auto"/>
-              <w:right w:val="none" w:sz="0" w:space="0" w:color="auto"/>
-              <w:insideH w:val="none" w:sz="0" w:space="0" w:color="auto"/>
-              <w:insideV w:val="none" w:sz="0" w:space="0" w:color="auto"/>
-            </w:tcBdr>
+            <w:tcBorders>
+              <w:top w:val="single" w:sz="6" w:space="0" w:color="1A3A5C"/>
+              <w:left w:val="single" w:sz="6" w:space="0" w:color="1A3A5C"/>
+              <w:bottom w:val="single" w:sz="6" w:space="0" w:color="1A3A5C"/>
+              <w:right w:val="single" w:sz="6" w:space="0" w:color="1A3A5C"/>
+            </w:tcBorders>
           </w:tcPr>
           <w:p>
             <w:pPr>
@@ -297,14 +289,12 @@
         <w:tc>
           <w:tcPr>
             <w:tcW w:type="dxa" w:w="3324"/>
-            <w:tcBdr>
-              <w:top w:val="none" w:sz="0" w:space="0" w:color="auto"/>
-              <w:left w:val="none" w:sz="0" w:space="0" w:color="auto"/>
-              <w:bottom w:val="none" w:sz="0" w:space="0" w:color="auto"/>
-              <w:right w:val="none" w:sz="0" w:space="0" w:color="auto"/>
-              <w:insideH w:val="none" w:sz="0" w:space="0" w:color="auto"/>
-              <w:insideV w:val="none" w:sz="0" w:space="0" w:color="auto"/>
-            </w:tcBdr>
+            <w:tcBorders>
+              <w:top w:val="single" w:sz="6" w:space="0" w:color="1A3A5C"/>
+              <w:left w:val="single" w:sz="6" w:space="0" w:color="1A3A5C"/>
+              <w:bottom w:val="single" w:sz="6" w:space="0" w:color="1A3A5C"/>
+              <w:right w:val="single" w:sz="6" w:space="0" w:color="1A3A5C"/>
+            </w:tcBorders>
           </w:tcPr>
           <w:p>
             <w:pPr>
@@ -335,14 +325,12 @@
         <w:tc>
           <w:tcPr>
             <w:tcW w:type="dxa" w:w="3324"/>
-            <w:tcBdr>
-              <w:top w:val="none" w:sz="0" w:space="0" w:color="auto"/>
-              <w:left w:val="none" w:sz="0" w:space="0" w:color="auto"/>
-              <w:bottom w:val="none" w:sz="0" w:space="0" w:color="auto"/>
-              <w:right w:val="none" w:sz="0" w:space="0" w:color="auto"/>
-              <w:insideH w:val="none" w:sz="0" w:space="0" w:color="auto"/>
-              <w:insideV w:val="none" w:sz="0" w:space="0" w:color="auto"/>
-            </w:tcBdr>
+            <w:tcBorders>
+              <w:top w:val="single" w:sz="6" w:space="0" w:color="1A3A5C"/>
+              <w:left w:val="single" w:sz="6" w:space="0" w:color="1A3A5C"/>
+              <w:bottom w:val="single" w:sz="6" w:space="0" w:color="1A3A5C"/>
+              <w:right w:val="single" w:sz="6" w:space="0" w:color="1A3A5C"/>
+            </w:tcBorders>
           </w:tcPr>
           <w:p>
             <w:pPr>
@@ -375,14 +363,12 @@
         <w:tc>
           <w:tcPr>
             <w:tcW w:type="dxa" w:w="3324"/>
-            <w:tcBdr>
-              <w:top w:val="none" w:sz="0" w:space="0" w:color="auto"/>
-              <w:left w:val="none" w:sz="0" w:space="0" w:color="auto"/>
-              <w:bottom w:val="none" w:sz="0" w:space="0" w:color="auto"/>
-              <w:right w:val="none" w:sz="0" w:space="0" w:color="auto"/>
-              <w:insideH w:val="none" w:sz="0" w:space="0" w:color="auto"/>
-              <w:insideV w:val="none" w:sz="0" w:space="0" w:color="auto"/>
-            </w:tcBdr>
+            <w:tcBorders>
+              <w:top w:val="single" w:sz="6" w:space="0" w:color="1A3A5C"/>
+              <w:left w:val="single" w:sz="6" w:space="0" w:color="1A3A5C"/>
+              <w:bottom w:val="single" w:sz="6" w:space="0" w:color="1A3A5C"/>
+              <w:right w:val="single" w:sz="6" w:space="0" w:color="1A3A5C"/>
+            </w:tcBorders>
           </w:tcPr>
           <w:p>
             <w:pPr>
@@ -413,28 +399,48 @@
         <w:tc>
           <w:tcPr>
             <w:tcW w:type="dxa" w:w="3324"/>
-            <w:tcBdr>
-              <w:top w:val="none" w:sz="0" w:space="0" w:color="auto"/>
-              <w:left w:val="none" w:sz="0" w:space="0" w:color="auto"/>
-              <w:bottom w:val="none" w:sz="0" w:space="0" w:color="auto"/>
-              <w:right w:val="none" w:sz="0" w:space="0" w:color="auto"/>
-              <w:insideH w:val="none" w:sz="0" w:space="0" w:color="auto"/>
-              <w:insideV w:val="none" w:sz="0" w:space="0" w:color="auto"/>
-            </w:tcBdr>
+            <w:tcBorders>
+              <w:top w:val="single" w:sz="6" w:space="0" w:color="1A3A5C"/>
+              <w:left w:val="single" w:sz="6" w:space="0" w:color="1A3A5C"/>
+              <w:bottom w:val="single" w:sz="6" w:space="0" w:color="1A3A5C"/>
+              <w:right w:val="single" w:sz="6" w:space="0" w:color="1A3A5C"/>
+            </w:tcBorders>
           </w:tcPr>
-          <w:p/>
+          <w:p>
+            <w:pPr>
+              <w:spacing w:before="40" w:after="40"/>
+            </w:pPr>
+            <w:r>
+              <w:rPr>
+                <w:rFonts w:ascii="Calibri" w:hAnsi="Calibri"/>
+                <w:b w:val="0"/>
+                <w:i w:val="0"/>
+                <w:color w:val="323232"/>
+                <w:sz w:val="21"/>
+              </w:rPr>
+              <w:t xml:space="preserve">SQL  </w:t>
+            </w:r>
+            <w:r>
+              <w:rPr>
+                <w:rFonts w:ascii="Calibri" w:hAnsi="Calibri"/>
+                <w:b w:val="0"/>
+                <w:i/>
+                <w:color w:val="2E75B6"/>
+                <w:sz w:val="18"/>
+              </w:rPr>
+              <w:t>[Advanced]</w:t>
+            </w:r>
+          </w:p>
         </w:tc>
         <w:tc>
           <w:tcPr>
             <w:tcW w:type="dxa" w:w="3324"/>
-            <w:tcBdr>
-              <w:top w:val="none" w:sz="0" w:space="0" w:color="auto"/>
-              <w:left w:val="none" w:sz="0" w:space="0" w:color="auto"/>
-              <w:bottom w:val="none" w:sz="0" w:space="0" w:color="auto"/>
-              <w:right w:val="none" w:sz="0" w:space="0" w:color="auto"/>
-              <w:insideH w:val="none" w:sz="0" w:space="0" w:color="auto"/>
-              <w:insideV w:val="none" w:sz="0" w:space="0" w:color="auto"/>
-            </w:tcBdr>
+            <w:tcBorders>
+              <w:top w:val="single" w:sz="6" w:space="0" w:color="1A3A5C"/>
+              <w:left w:val="single" w:sz="6" w:space="0" w:color="1A3A5C"/>
+              <w:bottom w:val="single" w:sz="6" w:space="0" w:color="1A3A5C"/>
+              <w:right w:val="single" w:sz="6" w:space="0" w:color="1A3A5C"/>
+            </w:tcBorders>
           </w:tcPr>
           <w:p/>
         </w:tc>
@@ -461,12 +467,12 @@
         <w:tblW w:type="auto" w:w="0"/>
         <w:tblLook w:firstColumn="1" w:firstRow="1" w:lastColumn="0" w:lastRow="0" w:noHBand="0" w:noVBand="1" w:val="04A0"/>
         <w:tblBorders>
-          <w:top w:val="none" w:sz="0" w:space="0" w:color="auto"/>
-          <w:left w:val="none" w:sz="0" w:space="0" w:color="auto"/>
-          <w:bottom w:val="none" w:sz="0" w:space="0" w:color="auto"/>
-          <w:right w:val="none" w:sz="0" w:space="0" w:color="auto"/>
-          <w:insideH w:val="none" w:sz="0" w:space="0" w:color="auto"/>
-          <w:insideV w:val="none" w:sz="0" w:space="0" w:color="auto"/>
+          <w:top w:val="single" w:sz="6" w:space="0" w:color="1A3A5C"/>
+          <w:left w:val="single" w:sz="6" w:space="0" w:color="1A3A5C"/>
+          <w:bottom w:val="single" w:sz="6" w:space="0" w:color="1A3A5C"/>
+          <w:right w:val="single" w:sz="6" w:space="0" w:color="1A3A5C"/>
+          <w:insideH w:val="single" w:sz="6" w:space="0" w:color="1A3A5C"/>
+          <w:insideV w:val="single" w:sz="6" w:space="0" w:color="1A3A5C"/>
         </w:tblBorders>
       </w:tblPr>
       <w:tblGrid>
@@ -478,14 +484,12 @@
         <w:tc>
           <w:tcPr>
             <w:tcW w:type="dxa" w:w="3324"/>
-            <w:tcBdr>
-              <w:top w:val="none" w:sz="0" w:space="0" w:color="auto"/>
-              <w:left w:val="none" w:sz="0" w:space="0" w:color="auto"/>
-              <w:bottom w:val="none" w:sz="0" w:space="0" w:color="auto"/>
-              <w:right w:val="none" w:sz="0" w:space="0" w:color="auto"/>
-              <w:insideH w:val="none" w:sz="0" w:space="0" w:color="auto"/>
-              <w:insideV w:val="none" w:sz="0" w:space="0" w:color="auto"/>
-            </w:tcBdr>
+            <w:tcBorders>
+              <w:top w:val="single" w:sz="6" w:space="0" w:color="1A3A5C"/>
+              <w:left w:val="single" w:sz="6" w:space="0" w:color="1A3A5C"/>
+              <w:bottom w:val="single" w:sz="6" w:space="0" w:color="1A3A5C"/>
+              <w:right w:val="single" w:sz="6" w:space="0" w:color="1A3A5C"/>
+            </w:tcBorders>
           </w:tcPr>
           <w:p>
             <w:pPr>
@@ -516,14 +520,12 @@
         <w:tc>
           <w:tcPr>
             <w:tcW w:type="dxa" w:w="3324"/>
-            <w:tcBdr>
-              <w:top w:val="none" w:sz="0" w:space="0" w:color="auto"/>
-              <w:left w:val="none" w:sz="0" w:space="0" w:color="auto"/>
-              <w:bottom w:val="none" w:sz="0" w:space="0" w:color="auto"/>
-              <w:right w:val="none" w:sz="0" w:space="0" w:color="auto"/>
-              <w:insideH w:val="none" w:sz="0" w:space="0" w:color="auto"/>
-              <w:insideV w:val="none" w:sz="0" w:space="0" w:color="auto"/>
-            </w:tcBdr>
+            <w:tcBorders>
+              <w:top w:val="single" w:sz="6" w:space="0" w:color="1A3A5C"/>
+              <w:left w:val="single" w:sz="6" w:space="0" w:color="1A3A5C"/>
+              <w:bottom w:val="single" w:sz="6" w:space="0" w:color="1A3A5C"/>
+              <w:right w:val="single" w:sz="6" w:space="0" w:color="1A3A5C"/>
+            </w:tcBorders>
           </w:tcPr>
           <w:p>
             <w:pPr>
@@ -554,14 +556,12 @@
         <w:tc>
           <w:tcPr>
             <w:tcW w:type="dxa" w:w="3324"/>
-            <w:tcBdr>
-              <w:top w:val="none" w:sz="0" w:space="0" w:color="auto"/>
-              <w:left w:val="none" w:sz="0" w:space="0" w:color="auto"/>
-              <w:bottom w:val="none" w:sz="0" w:space="0" w:color="auto"/>
-              <w:right w:val="none" w:sz="0" w:space="0" w:color="auto"/>
-              <w:insideH w:val="none" w:sz="0" w:space="0" w:color="auto"/>
-              <w:insideV w:val="none" w:sz="0" w:space="0" w:color="auto"/>
-            </w:tcBdr>
+            <w:tcBorders>
+              <w:top w:val="single" w:sz="6" w:space="0" w:color="1A3A5C"/>
+              <w:left w:val="single" w:sz="6" w:space="0" w:color="1A3A5C"/>
+              <w:bottom w:val="single" w:sz="6" w:space="0" w:color="1A3A5C"/>
+              <w:right w:val="single" w:sz="6" w:space="0" w:color="1A3A5C"/>
+            </w:tcBorders>
           </w:tcPr>
           <w:p>
             <w:pPr>
@@ -594,14 +594,12 @@
         <w:tc>
           <w:tcPr>
             <w:tcW w:type="dxa" w:w="3324"/>
-            <w:tcBdr>
-              <w:top w:val="none" w:sz="0" w:space="0" w:color="auto"/>
-              <w:left w:val="none" w:sz="0" w:space="0" w:color="auto"/>
-              <w:bottom w:val="none" w:sz="0" w:space="0" w:color="auto"/>
-              <w:right w:val="none" w:sz="0" w:space="0" w:color="auto"/>
-              <w:insideH w:val="none" w:sz="0" w:space="0" w:color="auto"/>
-              <w:insideV w:val="none" w:sz="0" w:space="0" w:color="auto"/>
-            </w:tcBdr>
+            <w:tcBorders>
+              <w:top w:val="single" w:sz="6" w:space="0" w:color="1A3A5C"/>
+              <w:left w:val="single" w:sz="6" w:space="0" w:color="1A3A5C"/>
+              <w:bottom w:val="single" w:sz="6" w:space="0" w:color="1A3A5C"/>
+              <w:right w:val="single" w:sz="6" w:space="0" w:color="1A3A5C"/>
+            </w:tcBorders>
           </w:tcPr>
           <w:p>
             <w:pPr>
@@ -632,14 +630,12 @@
         <w:tc>
           <w:tcPr>
             <w:tcW w:type="dxa" w:w="3324"/>
-            <w:tcBdr>
-              <w:top w:val="none" w:sz="0" w:space="0" w:color="auto"/>
-              <w:left w:val="none" w:sz="0" w:space="0" w:color="auto"/>
-              <w:bottom w:val="none" w:sz="0" w:space="0" w:color="auto"/>
-              <w:right w:val="none" w:sz="0" w:space="0" w:color="auto"/>
-              <w:insideH w:val="none" w:sz="0" w:space="0" w:color="auto"/>
-              <w:insideV w:val="none" w:sz="0" w:space="0" w:color="auto"/>
-            </w:tcBdr>
+            <w:tcBorders>
+              <w:top w:val="single" w:sz="6" w:space="0" w:color="1A3A5C"/>
+              <w:left w:val="single" w:sz="6" w:space="0" w:color="1A3A5C"/>
+              <w:bottom w:val="single" w:sz="6" w:space="0" w:color="1A3A5C"/>
+              <w:right w:val="single" w:sz="6" w:space="0" w:color="1A3A5C"/>
+            </w:tcBorders>
           </w:tcPr>
           <w:p>
             <w:pPr>
@@ -670,16 +666,38 @@
         <w:tc>
           <w:tcPr>
             <w:tcW w:type="dxa" w:w="3324"/>
-            <w:tcBdr>
-              <w:top w:val="none" w:sz="0" w:space="0" w:color="auto"/>
-              <w:left w:val="none" w:sz="0" w:space="0" w:color="auto"/>
-              <w:bottom w:val="none" w:sz="0" w:space="0" w:color="auto"/>
-              <w:right w:val="none" w:sz="0" w:space="0" w:color="auto"/>
-              <w:insideH w:val="none" w:sz="0" w:space="0" w:color="auto"/>
-              <w:insideV w:val="none" w:sz="0" w:space="0" w:color="auto"/>
-            </w:tcBdr>
+            <w:tcBorders>
+              <w:top w:val="single" w:sz="6" w:space="0" w:color="1A3A5C"/>
+              <w:left w:val="single" w:sz="6" w:space="0" w:color="1A3A5C"/>
+              <w:bottom w:val="single" w:sz="6" w:space="0" w:color="1A3A5C"/>
+              <w:right w:val="single" w:sz="6" w:space="0" w:color="1A3A5C"/>
+            </w:tcBorders>
           </w:tcPr>
-          <w:p/>
+          <w:p>
+            <w:pPr>
+              <w:spacing w:before="40" w:after="40"/>
+            </w:pPr>
+            <w:r>
+              <w:rPr>
+                <w:rFonts w:ascii="Calibri" w:hAnsi="Calibri"/>
+                <w:b w:val="0"/>
+                <w:i w:val="0"/>
+                <w:color w:val="323232"/>
+                <w:sz w:val="21"/>
+              </w:rPr>
+              <w:t xml:space="preserve">Saprk  </w:t>
+            </w:r>
+            <w:r>
+              <w:rPr>
+                <w:rFonts w:ascii="Calibri" w:hAnsi="Calibri"/>
+                <w:b w:val="0"/>
+                <w:i/>
+                <w:color w:val="2E75B6"/>
+                <w:sz w:val="18"/>
+              </w:rPr>
+              <w:t>[Advanced]</w:t>
+            </w:r>
+          </w:p>
         </w:tc>
       </w:tr>
     </w:tbl>
@@ -704,12 +722,12 @@
         <w:tblW w:type="auto" w:w="0"/>
         <w:tblLook w:firstColumn="1" w:firstRow="1" w:lastColumn="0" w:lastRow="0" w:noHBand="0" w:noVBand="1" w:val="04A0"/>
         <w:tblBorders>
-          <w:top w:val="none" w:sz="0" w:space="0" w:color="auto"/>
-          <w:left w:val="none" w:sz="0" w:space="0" w:color="auto"/>
-          <w:bottom w:val="none" w:sz="0" w:space="0" w:color="auto"/>
-          <w:right w:val="none" w:sz="0" w:space="0" w:color="auto"/>
-          <w:insideH w:val="none" w:sz="0" w:space="0" w:color="auto"/>
-          <w:insideV w:val="none" w:sz="0" w:space="0" w:color="auto"/>
+          <w:top w:val="single" w:sz="6" w:space="0" w:color="1A3A5C"/>
+          <w:left w:val="single" w:sz="6" w:space="0" w:color="1A3A5C"/>
+          <w:bottom w:val="single" w:sz="6" w:space="0" w:color="1A3A5C"/>
+          <w:right w:val="single" w:sz="6" w:space="0" w:color="1A3A5C"/>
+          <w:insideH w:val="single" w:sz="6" w:space="0" w:color="1A3A5C"/>
+          <w:insideV w:val="single" w:sz="6" w:space="0" w:color="1A3A5C"/>
         </w:tblBorders>
       </w:tblPr>
       <w:tblGrid>
@@ -721,52 +739,12 @@
         <w:tc>
           <w:tcPr>
             <w:tcW w:type="dxa" w:w="3324"/>
-            <w:tcBdr>
-              <w:top w:val="none" w:sz="0" w:space="0" w:color="auto"/>
-              <w:left w:val="none" w:sz="0" w:space="0" w:color="auto"/>
-              <w:bottom w:val="none" w:sz="0" w:space="0" w:color="auto"/>
-              <w:right w:val="none" w:sz="0" w:space="0" w:color="auto"/>
-              <w:insideH w:val="none" w:sz="0" w:space="0" w:color="auto"/>
-              <w:insideV w:val="none" w:sz="0" w:space="0" w:color="auto"/>
-            </w:tcBdr>
-          </w:tcPr>
-          <w:p>
-            <w:pPr>
-              <w:spacing w:before="40" w:after="40"/>
-            </w:pPr>
-            <w:r>
-              <w:rPr>
-                <w:rFonts w:ascii="Calibri" w:hAnsi="Calibri"/>
-                <w:b w:val="0"/>
-                <w:i w:val="0"/>
-                <w:color w:val="323232"/>
-                <w:sz w:val="21"/>
-              </w:rPr>
-              <w:t xml:space="preserve">SQL  </w:t>
-            </w:r>
-            <w:r>
-              <w:rPr>
-                <w:rFonts w:ascii="Calibri" w:hAnsi="Calibri"/>
-                <w:b w:val="0"/>
-                <w:i/>
-                <w:color w:val="2E75B6"/>
-                <w:sz w:val="18"/>
-              </w:rPr>
-              <w:t>[Advanced]</w:t>
-            </w:r>
-          </w:p>
-        </w:tc>
-        <w:tc>
-          <w:tcPr>
-            <w:tcW w:type="dxa" w:w="3324"/>
-            <w:tcBdr>
-              <w:top w:val="none" w:sz="0" w:space="0" w:color="auto"/>
-              <w:left w:val="none" w:sz="0" w:space="0" w:color="auto"/>
-              <w:bottom w:val="none" w:sz="0" w:space="0" w:color="auto"/>
-              <w:right w:val="none" w:sz="0" w:space="0" w:color="auto"/>
-              <w:insideH w:val="none" w:sz="0" w:space="0" w:color="auto"/>
-              <w:insideV w:val="none" w:sz="0" w:space="0" w:color="auto"/>
-            </w:tcBdr>
+            <w:tcBorders>
+              <w:top w:val="single" w:sz="6" w:space="0" w:color="1A3A5C"/>
+              <w:left w:val="single" w:sz="6" w:space="0" w:color="1A3A5C"/>
+              <w:bottom w:val="single" w:sz="6" w:space="0" w:color="1A3A5C"/>
+              <w:right w:val="single" w:sz="6" w:space="0" w:color="1A3A5C"/>
+            </w:tcBorders>
           </w:tcPr>
           <w:p>
             <w:pPr>
@@ -797,14 +775,12 @@
         <w:tc>
           <w:tcPr>
             <w:tcW w:type="dxa" w:w="3324"/>
-            <w:tcBdr>
-              <w:top w:val="none" w:sz="0" w:space="0" w:color="auto"/>
-              <w:left w:val="none" w:sz="0" w:space="0" w:color="auto"/>
-              <w:bottom w:val="none" w:sz="0" w:space="0" w:color="auto"/>
-              <w:right w:val="none" w:sz="0" w:space="0" w:color="auto"/>
-              <w:insideH w:val="none" w:sz="0" w:space="0" w:color="auto"/>
-              <w:insideV w:val="none" w:sz="0" w:space="0" w:color="auto"/>
-            </w:tcBdr>
+            <w:tcBorders>
+              <w:top w:val="single" w:sz="6" w:space="0" w:color="1A3A5C"/>
+              <w:left w:val="single" w:sz="6" w:space="0" w:color="1A3A5C"/>
+              <w:bottom w:val="single" w:sz="6" w:space="0" w:color="1A3A5C"/>
+              <w:right w:val="single" w:sz="6" w:space="0" w:color="1A3A5C"/>
+            </w:tcBorders>
           </w:tcPr>
           <w:p>
             <w:pPr>
@@ -832,19 +808,15 @@
             </w:r>
           </w:p>
         </w:tc>
-      </w:tr>
-      <w:tr>
         <w:tc>
           <w:tcPr>
             <w:tcW w:type="dxa" w:w="3324"/>
-            <w:tcBdr>
-              <w:top w:val="none" w:sz="0" w:space="0" w:color="auto"/>
-              <w:left w:val="none" w:sz="0" w:space="0" w:color="auto"/>
-              <w:bottom w:val="none" w:sz="0" w:space="0" w:color="auto"/>
-              <w:right w:val="none" w:sz="0" w:space="0" w:color="auto"/>
-              <w:insideH w:val="none" w:sz="0" w:space="0" w:color="auto"/>
-              <w:insideV w:val="none" w:sz="0" w:space="0" w:color="auto"/>
-            </w:tcBdr>
+            <w:tcBorders>
+              <w:top w:val="single" w:sz="6" w:space="0" w:color="1A3A5C"/>
+              <w:left w:val="single" w:sz="6" w:space="0" w:color="1A3A5C"/>
+              <w:bottom w:val="single" w:sz="6" w:space="0" w:color="1A3A5C"/>
+              <w:right w:val="single" w:sz="6" w:space="0" w:color="1A3A5C"/>
+            </w:tcBorders>
           </w:tcPr>
           <w:p>
             <w:pPr>
@@ -872,34 +844,6 @@
             </w:r>
           </w:p>
         </w:tc>
-        <w:tc>
-          <w:tcPr>
-            <w:tcW w:type="dxa" w:w="3324"/>
-            <w:tcBdr>
-              <w:top w:val="none" w:sz="0" w:space="0" w:color="auto"/>
-              <w:left w:val="none" w:sz="0" w:space="0" w:color="auto"/>
-              <w:bottom w:val="none" w:sz="0" w:space="0" w:color="auto"/>
-              <w:right w:val="none" w:sz="0" w:space="0" w:color="auto"/>
-              <w:insideH w:val="none" w:sz="0" w:space="0" w:color="auto"/>
-              <w:insideV w:val="none" w:sz="0" w:space="0" w:color="auto"/>
-            </w:tcBdr>
-          </w:tcPr>
-          <w:p/>
-        </w:tc>
-        <w:tc>
-          <w:tcPr>
-            <w:tcW w:type="dxa" w:w="3324"/>
-            <w:tcBdr>
-              <w:top w:val="none" w:sz="0" w:space="0" w:color="auto"/>
-              <w:left w:val="none" w:sz="0" w:space="0" w:color="auto"/>
-              <w:bottom w:val="none" w:sz="0" w:space="0" w:color="auto"/>
-              <w:right w:val="none" w:sz="0" w:space="0" w:color="auto"/>
-              <w:insideH w:val="none" w:sz="0" w:space="0" w:color="auto"/>
-              <w:insideV w:val="none" w:sz="0" w:space="0" w:color="auto"/>
-            </w:tcBdr>
-          </w:tcPr>
-          <w:p/>
-        </w:tc>
       </w:tr>
     </w:tbl>
     <w:p/>
@@ -923,12 +867,12 @@
         <w:tblW w:type="auto" w:w="0"/>
         <w:tblLook w:firstColumn="1" w:firstRow="1" w:lastColumn="0" w:lastRow="0" w:noHBand="0" w:noVBand="1" w:val="04A0"/>
         <w:tblBorders>
-          <w:top w:val="none" w:sz="0" w:space="0" w:color="auto"/>
-          <w:left w:val="none" w:sz="0" w:space="0" w:color="auto"/>
-          <w:bottom w:val="none" w:sz="0" w:space="0" w:color="auto"/>
-          <w:right w:val="none" w:sz="0" w:space="0" w:color="auto"/>
-          <w:insideH w:val="none" w:sz="0" w:space="0" w:color="auto"/>
-          <w:insideV w:val="none" w:sz="0" w:space="0" w:color="auto"/>
+          <w:top w:val="single" w:sz="6" w:space="0" w:color="1A3A5C"/>
+          <w:left w:val="single" w:sz="6" w:space="0" w:color="1A3A5C"/>
+          <w:bottom w:val="single" w:sz="6" w:space="0" w:color="1A3A5C"/>
+          <w:right w:val="single" w:sz="6" w:space="0" w:color="1A3A5C"/>
+          <w:insideH w:val="single" w:sz="6" w:space="0" w:color="1A3A5C"/>
+          <w:insideV w:val="single" w:sz="6" w:space="0" w:color="1A3A5C"/>
         </w:tblBorders>
       </w:tblPr>
       <w:tblGrid>
@@ -940,14 +884,12 @@
         <w:tc>
           <w:tcPr>
             <w:tcW w:type="dxa" w:w="3324"/>
-            <w:tcBdr>
-              <w:top w:val="none" w:sz="0" w:space="0" w:color="auto"/>
-              <w:left w:val="none" w:sz="0" w:space="0" w:color="auto"/>
-              <w:bottom w:val="none" w:sz="0" w:space="0" w:color="auto"/>
-              <w:right w:val="none" w:sz="0" w:space="0" w:color="auto"/>
-              <w:insideH w:val="none" w:sz="0" w:space="0" w:color="auto"/>
-              <w:insideV w:val="none" w:sz="0" w:space="0" w:color="auto"/>
-            </w:tcBdr>
+            <w:tcBorders>
+              <w:top w:val="single" w:sz="6" w:space="0" w:color="1A3A5C"/>
+              <w:left w:val="single" w:sz="6" w:space="0" w:color="1A3A5C"/>
+              <w:bottom w:val="single" w:sz="6" w:space="0" w:color="1A3A5C"/>
+              <w:right w:val="single" w:sz="6" w:space="0" w:color="1A3A5C"/>
+            </w:tcBorders>
           </w:tcPr>
           <w:p>
             <w:pPr>
@@ -978,14 +920,12 @@
         <w:tc>
           <w:tcPr>
             <w:tcW w:type="dxa" w:w="3324"/>
-            <w:tcBdr>
-              <w:top w:val="none" w:sz="0" w:space="0" w:color="auto"/>
-              <w:left w:val="none" w:sz="0" w:space="0" w:color="auto"/>
-              <w:bottom w:val="none" w:sz="0" w:space="0" w:color="auto"/>
-              <w:right w:val="none" w:sz="0" w:space="0" w:color="auto"/>
-              <w:insideH w:val="none" w:sz="0" w:space="0" w:color="auto"/>
-              <w:insideV w:val="none" w:sz="0" w:space="0" w:color="auto"/>
-            </w:tcBdr>
+            <w:tcBorders>
+              <w:top w:val="single" w:sz="6" w:space="0" w:color="1A3A5C"/>
+              <w:left w:val="single" w:sz="6" w:space="0" w:color="1A3A5C"/>
+              <w:bottom w:val="single" w:sz="6" w:space="0" w:color="1A3A5C"/>
+              <w:right w:val="single" w:sz="6" w:space="0" w:color="1A3A5C"/>
+            </w:tcBorders>
           </w:tcPr>
           <w:p>
             <w:pPr>
@@ -1016,14 +956,12 @@
         <w:tc>
           <w:tcPr>
             <w:tcW w:type="dxa" w:w="3324"/>
-            <w:tcBdr>
-              <w:top w:val="none" w:sz="0" w:space="0" w:color="auto"/>
-              <w:left w:val="none" w:sz="0" w:space="0" w:color="auto"/>
-              <w:bottom w:val="none" w:sz="0" w:space="0" w:color="auto"/>
-              <w:right w:val="none" w:sz="0" w:space="0" w:color="auto"/>
-              <w:insideH w:val="none" w:sz="0" w:space="0" w:color="auto"/>
-              <w:insideV w:val="none" w:sz="0" w:space="0" w:color="auto"/>
-            </w:tcBdr>
+            <w:tcBorders>
+              <w:top w:val="single" w:sz="6" w:space="0" w:color="1A3A5C"/>
+              <w:left w:val="single" w:sz="6" w:space="0" w:color="1A3A5C"/>
+              <w:bottom w:val="single" w:sz="6" w:space="0" w:color="1A3A5C"/>
+              <w:right w:val="single" w:sz="6" w:space="0" w:color="1A3A5C"/>
+            </w:tcBorders>
           </w:tcPr>
           <w:p>
             <w:pPr>

</xml_diff>